<commit_message>
Add trust rating table and figure
</commit_message>
<xml_diff>
--- a/Submissions/Class 3 Group 6 IMRD.docx
+++ b/Submissions/Class 3 Group 6 IMRD.docx
@@ -2,7 +2,7 @@
 <file path=word/document.xml><?xml version="1.0" encoding="utf-8"?>
 <w:document xmlns:w="http://schemas.openxmlformats.org/wordprocessingml/2006/main" xmlns:m="http://schemas.openxmlformats.org/officeDocument/2006/math" xmlns:r="http://schemas.openxmlformats.org/officeDocument/2006/relationships" xmlns:o="urn:schemas-microsoft-com:office:office" xmlns:v="urn:schemas-microsoft-com:vml" xmlns:w10="urn:schemas-microsoft-com:office:word" xmlns:a="http://schemas.openxmlformats.org/drawingml/2006/main" xmlns:pic="http://schemas.openxmlformats.org/drawingml/2006/picture" xmlns:wp="http://schemas.openxmlformats.org/drawingml/2006/wordprocessingDrawing">
   <w:body>
-    <w:bookmarkStart w:id="36" w:name="X04ed1b7af9dcce6489bcd815eca175c2eed566d"/>
+    <w:bookmarkStart w:id="37" w:name="X04ed1b7af9dcce6489bcd815eca175c2eed566d"/>
     <w:p>
       <w:pPr>
         <w:pStyle w:val="Heading1"/>
@@ -1644,7 +1644,7 @@
     </w:p>
     <w:bookmarkEnd w:id="26"/>
     <w:bookmarkEnd w:id="27"/>
-    <w:bookmarkStart w:id="29" w:name="results"/>
+    <w:bookmarkStart w:id="30" w:name="results"/>
     <w:p>
       <w:pPr>
         <w:pStyle w:val="Heading2"/>
@@ -2669,6 +2669,555 @@
     </w:p>
     <w:p>
       <w:pPr>
+        <w:pStyle w:val="Caption"/>
+        <w:keepNext/>
+        <w:keepLines w:val="0"/>
+        <w:spacing w:line="480" w:lineRule="auto" w:before="120" w:after="120"/>
+        <w:ind w:firstLine="0" w:left="0"/>
+        <w:jc w:val="center"/>
+      </w:pPr>
+      <w:r>
+        <w:rPr>
+          <w:rFonts w:ascii="Times New Roman" w:hAnsi="Times New Roman" w:eastAsia="Times New Roman" w:cs="Times New Roman"/>
+          <w:b/>
+          <w:sz w:val="22"/>
+        </w:rPr>
+        <w:t>Table 3.</w:t>
+      </w:r>
+      <w:r>
+        <w:rPr>
+          <w:rFonts w:ascii="Times New Roman" w:hAnsi="Times New Roman" w:eastAsia="Times New Roman" w:cs="Times New Roman"/>
+          <w:b w:val="0"/>
+          <w:sz w:val="22"/>
+        </w:rPr>
+        <w:t xml:space="preserve"> Mean trust ratings by image source and visual category</w:t>
+      </w:r>
+    </w:p>
+    <w:tbl>
+      <w:tblPr>
+        <w:tblStyle w:val="Table"/>
+        <w:tblW w:type="pct" w:w="0.0"/>
+        <w:jc w:val="center"/>
+        <w:tblLook w:firstRow="1" w:lastRow="0" w:firstColumn="0" w:lastColumn="0" w:noHBand="0" w:noVBand="0" w:val="0020"/>
+      </w:tblPr>
+      <w:tblGrid/>
+      <w:tr>
+        <w:tc>
+          <w:tcPr>
+            <w:vAlign w:val="center"/>
+            <w:tcMar>
+              <w:top w:w="100" w:type="dxa"/>
+              <w:left w:w="100" w:type="dxa"/>
+              <w:bottom w:w="100" w:type="dxa"/>
+              <w:right w:w="100" w:type="dxa"/>
+            </w:tcMar>
+          </w:tcPr>
+          <w:p>
+            <w:pPr>
+              <w:pStyle w:val="Compact"/>
+              <w:spacing w:line="276" w:lineRule="auto" w:before="0" w:after="0"/>
+              <w:ind w:firstLine="0"/>
+              <w:jc w:val="left"/>
+            </w:pPr>
+            <w:r>
+              <w:rPr>
+                <w:rFonts w:ascii="Times New Roman" w:hAnsi="Times New Roman" w:eastAsia="Times New Roman" w:cs="Times New Roman"/>
+                <w:b/>
+                <w:sz w:val="22"/>
+              </w:rPr>
+              <w:t xml:space="preserve">Group</w:t>
+            </w:r>
+          </w:p>
+        </w:tc>
+        <w:tc>
+          <w:tcPr>
+            <w:vAlign w:val="center"/>
+            <w:tcMar>
+              <w:top w:w="100" w:type="dxa"/>
+              <w:left w:w="100" w:type="dxa"/>
+              <w:bottom w:w="100" w:type="dxa"/>
+              <w:right w:w="100" w:type="dxa"/>
+            </w:tcMar>
+          </w:tcPr>
+          <w:p>
+            <w:pPr>
+              <w:pStyle w:val="Compact"/>
+              <w:spacing w:line="276" w:lineRule="auto" w:before="0" w:after="0"/>
+              <w:ind w:firstLine="0"/>
+              <w:jc w:val="right"/>
+            </w:pPr>
+            <w:r>
+              <w:rPr>
+                <w:rFonts w:ascii="Times New Roman" w:hAnsi="Times New Roman" w:eastAsia="Times New Roman" w:cs="Times New Roman"/>
+                <w:b/>
+                <w:sz w:val="22"/>
+              </w:rPr>
+              <w:t xml:space="preserve">Mean trust rating</w:t>
+            </w:r>
+          </w:p>
+        </w:tc>
+      </w:tr>
+      <w:tr>
+        <w:tc>
+          <w:tcPr>
+            <w:vAlign w:val="center"/>
+            <w:tcMar>
+              <w:top w:w="100" w:type="dxa"/>
+              <w:left w:w="100" w:type="dxa"/>
+              <w:bottom w:w="100" w:type="dxa"/>
+              <w:right w:w="100" w:type="dxa"/>
+            </w:tcMar>
+          </w:tcPr>
+          <w:p>
+            <w:pPr>
+              <w:pStyle w:val="Compact"/>
+              <w:spacing w:line="276" w:lineRule="auto" w:before="0" w:after="0"/>
+              <w:ind w:firstLine="0"/>
+              <w:jc w:val="left"/>
+            </w:pPr>
+            <w:r>
+              <w:rPr>
+                <w:rFonts w:ascii="Times New Roman" w:hAnsi="Times New Roman" w:eastAsia="Times New Roman" w:cs="Times New Roman"/>
+                <w:sz w:val="22"/>
+              </w:rPr>
+              <w:t xml:space="preserve">AI-generated images</w:t>
+            </w:r>
+          </w:p>
+        </w:tc>
+        <w:tc>
+          <w:tcPr>
+            <w:vAlign w:val="center"/>
+            <w:tcMar>
+              <w:top w:w="100" w:type="dxa"/>
+              <w:left w:w="100" w:type="dxa"/>
+              <w:bottom w:w="100" w:type="dxa"/>
+              <w:right w:w="100" w:type="dxa"/>
+            </w:tcMar>
+          </w:tcPr>
+          <w:p>
+            <w:pPr>
+              <w:pStyle w:val="Compact"/>
+              <w:spacing w:line="276" w:lineRule="auto" w:before="0" w:after="0"/>
+              <w:ind w:firstLine="0"/>
+              <w:jc w:val="right"/>
+            </w:pPr>
+            <w:r>
+              <w:rPr>
+                <w:rFonts w:ascii="Times New Roman" w:hAnsi="Times New Roman" w:eastAsia="Times New Roman" w:cs="Times New Roman"/>
+                <w:sz w:val="22"/>
+              </w:rPr>
+              <w:t xml:space="preserve">2.70</w:t>
+            </w:r>
+          </w:p>
+        </w:tc>
+      </w:tr>
+      <w:tr>
+        <w:tc>
+          <w:tcPr>
+            <w:vAlign w:val="center"/>
+            <w:tcMar>
+              <w:top w:w="100" w:type="dxa"/>
+              <w:left w:w="100" w:type="dxa"/>
+              <w:bottom w:w="100" w:type="dxa"/>
+              <w:right w:w="100" w:type="dxa"/>
+            </w:tcMar>
+          </w:tcPr>
+          <w:p>
+            <w:pPr>
+              <w:pStyle w:val="Compact"/>
+              <w:spacing w:line="276" w:lineRule="auto" w:before="0" w:after="0"/>
+              <w:ind w:firstLine="0"/>
+              <w:jc w:val="left"/>
+            </w:pPr>
+            <w:r>
+              <w:rPr>
+                <w:rFonts w:ascii="Times New Roman" w:hAnsi="Times New Roman" w:eastAsia="Times New Roman" w:cs="Times New Roman"/>
+                <w:sz w:val="22"/>
+              </w:rPr>
+              <w:t xml:space="preserve">Real images/screenshots</w:t>
+            </w:r>
+          </w:p>
+        </w:tc>
+        <w:tc>
+          <w:tcPr>
+            <w:vAlign w:val="center"/>
+            <w:tcMar>
+              <w:top w:w="100" w:type="dxa"/>
+              <w:left w:w="100" w:type="dxa"/>
+              <w:bottom w:w="100" w:type="dxa"/>
+              <w:right w:w="100" w:type="dxa"/>
+            </w:tcMar>
+          </w:tcPr>
+          <w:p>
+            <w:pPr>
+              <w:pStyle w:val="Compact"/>
+              <w:spacing w:line="276" w:lineRule="auto" w:before="0" w:after="0"/>
+              <w:ind w:firstLine="0"/>
+              <w:jc w:val="right"/>
+            </w:pPr>
+            <w:r>
+              <w:rPr>
+                <w:rFonts w:ascii="Times New Roman" w:hAnsi="Times New Roman" w:eastAsia="Times New Roman" w:cs="Times New Roman"/>
+                <w:sz w:val="22"/>
+              </w:rPr>
+              <w:t xml:space="preserve">2.99</w:t>
+            </w:r>
+          </w:p>
+        </w:tc>
+      </w:tr>
+      <w:tr>
+        <w:tc>
+          <w:tcPr>
+            <w:vAlign w:val="center"/>
+            <w:tcMar>
+              <w:top w:w="100" w:type="dxa"/>
+              <w:left w:w="100" w:type="dxa"/>
+              <w:bottom w:w="100" w:type="dxa"/>
+              <w:right w:w="100" w:type="dxa"/>
+            </w:tcMar>
+          </w:tcPr>
+          <w:p>
+            <w:pPr>
+              <w:pStyle w:val="Compact"/>
+              <w:spacing w:line="276" w:lineRule="auto" w:before="0" w:after="0"/>
+              <w:ind w:firstLine="0"/>
+              <w:jc w:val="left"/>
+            </w:pPr>
+            <w:r>
+              <w:rPr>
+                <w:rFonts w:ascii="Times New Roman" w:hAnsi="Times New Roman" w:eastAsia="Times New Roman" w:cs="Times New Roman"/>
+                <w:sz w:val="22"/>
+              </w:rPr>
+              <w:t xml:space="preserve">Portrait images</w:t>
+            </w:r>
+          </w:p>
+        </w:tc>
+        <w:tc>
+          <w:tcPr>
+            <w:vAlign w:val="center"/>
+            <w:tcMar>
+              <w:top w:w="100" w:type="dxa"/>
+              <w:left w:w="100" w:type="dxa"/>
+              <w:bottom w:w="100" w:type="dxa"/>
+              <w:right w:w="100" w:type="dxa"/>
+            </w:tcMar>
+          </w:tcPr>
+          <w:p>
+            <w:pPr>
+              <w:pStyle w:val="Compact"/>
+              <w:spacing w:line="276" w:lineRule="auto" w:before="0" w:after="0"/>
+              <w:ind w:firstLine="0"/>
+              <w:jc w:val="right"/>
+            </w:pPr>
+            <w:r>
+              <w:rPr>
+                <w:rFonts w:ascii="Times New Roman" w:hAnsi="Times New Roman" w:eastAsia="Times New Roman" w:cs="Times New Roman"/>
+                <w:sz w:val="22"/>
+              </w:rPr>
+              <w:t xml:space="preserve">3.14</w:t>
+            </w:r>
+          </w:p>
+        </w:tc>
+      </w:tr>
+      <w:tr>
+        <w:tc>
+          <w:tcPr>
+            <w:vAlign w:val="center"/>
+            <w:tcMar>
+              <w:top w:w="100" w:type="dxa"/>
+              <w:left w:w="100" w:type="dxa"/>
+              <w:bottom w:w="100" w:type="dxa"/>
+              <w:right w:w="100" w:type="dxa"/>
+            </w:tcMar>
+          </w:tcPr>
+          <w:p>
+            <w:pPr>
+              <w:pStyle w:val="Compact"/>
+              <w:spacing w:line="276" w:lineRule="auto" w:before="0" w:after="0"/>
+              <w:ind w:firstLine="0"/>
+              <w:jc w:val="left"/>
+            </w:pPr>
+            <w:r>
+              <w:rPr>
+                <w:rFonts w:ascii="Times New Roman" w:hAnsi="Times New Roman" w:eastAsia="Times New Roman" w:cs="Times New Roman"/>
+                <w:sz w:val="22"/>
+              </w:rPr>
+              <w:t xml:space="preserve">Text-bearing visual artifacts</w:t>
+            </w:r>
+          </w:p>
+        </w:tc>
+        <w:tc>
+          <w:tcPr>
+            <w:vAlign w:val="center"/>
+            <w:tcMar>
+              <w:top w:w="100" w:type="dxa"/>
+              <w:left w:w="100" w:type="dxa"/>
+              <w:bottom w:w="100" w:type="dxa"/>
+              <w:right w:w="100" w:type="dxa"/>
+            </w:tcMar>
+          </w:tcPr>
+          <w:p>
+            <w:pPr>
+              <w:pStyle w:val="Compact"/>
+              <w:spacing w:line="276" w:lineRule="auto" w:before="0" w:after="0"/>
+              <w:ind w:firstLine="0"/>
+              <w:jc w:val="right"/>
+            </w:pPr>
+            <w:r>
+              <w:rPr>
+                <w:rFonts w:ascii="Times New Roman" w:hAnsi="Times New Roman" w:eastAsia="Times New Roman" w:cs="Times New Roman"/>
+                <w:sz w:val="22"/>
+              </w:rPr>
+              <w:t xml:space="preserve">2.98</w:t>
+            </w:r>
+          </w:p>
+        </w:tc>
+      </w:tr>
+      <w:tr>
+        <w:tc>
+          <w:tcPr>
+            <w:vAlign w:val="center"/>
+            <w:tcMar>
+              <w:top w:w="100" w:type="dxa"/>
+              <w:left w:w="100" w:type="dxa"/>
+              <w:bottom w:w="100" w:type="dxa"/>
+              <w:right w:w="100" w:type="dxa"/>
+            </w:tcMar>
+          </w:tcPr>
+          <w:p>
+            <w:pPr>
+              <w:pStyle w:val="Compact"/>
+              <w:spacing w:line="276" w:lineRule="auto" w:before="0" w:after="0"/>
+              <w:ind w:firstLine="0"/>
+              <w:jc w:val="left"/>
+            </w:pPr>
+            <w:r>
+              <w:rPr>
+                <w:rFonts w:ascii="Times New Roman" w:hAnsi="Times New Roman" w:eastAsia="Times New Roman" w:cs="Times New Roman"/>
+                <w:sz w:val="22"/>
+              </w:rPr>
+              <w:t xml:space="preserve">Virtual livestream interfaces</w:t>
+            </w:r>
+          </w:p>
+        </w:tc>
+        <w:tc>
+          <w:tcPr>
+            <w:vAlign w:val="center"/>
+            <w:tcMar>
+              <w:top w:w="100" w:type="dxa"/>
+              <w:left w:w="100" w:type="dxa"/>
+              <w:bottom w:w="100" w:type="dxa"/>
+              <w:right w:w="100" w:type="dxa"/>
+            </w:tcMar>
+          </w:tcPr>
+          <w:p>
+            <w:pPr>
+              <w:pStyle w:val="Compact"/>
+              <w:spacing w:line="276" w:lineRule="auto" w:before="0" w:after="0"/>
+              <w:ind w:firstLine="0"/>
+              <w:jc w:val="right"/>
+            </w:pPr>
+            <w:r>
+              <w:rPr>
+                <w:rFonts w:ascii="Times New Roman" w:hAnsi="Times New Roman" w:eastAsia="Times New Roman" w:cs="Times New Roman"/>
+                <w:sz w:val="22"/>
+              </w:rPr>
+              <w:t xml:space="preserve">2.73</w:t>
+            </w:r>
+          </w:p>
+        </w:tc>
+      </w:tr>
+      <w:tr>
+        <w:tc>
+          <w:tcPr>
+            <w:vAlign w:val="center"/>
+            <w:tcMar>
+              <w:top w:w="100" w:type="dxa"/>
+              <w:left w:w="100" w:type="dxa"/>
+              <w:bottom w:w="100" w:type="dxa"/>
+              <w:right w:w="100" w:type="dxa"/>
+            </w:tcMar>
+          </w:tcPr>
+          <w:p>
+            <w:pPr>
+              <w:pStyle w:val="Compact"/>
+              <w:spacing w:line="276" w:lineRule="auto" w:before="0" w:after="0"/>
+              <w:ind w:firstLine="0"/>
+              <w:jc w:val="left"/>
+            </w:pPr>
+            <w:r>
+              <w:rPr>
+                <w:rFonts w:ascii="Times New Roman" w:hAnsi="Times New Roman" w:eastAsia="Times New Roman" w:cs="Times New Roman"/>
+                <w:sz w:val="22"/>
+              </w:rPr>
+              <w:t xml:space="preserve">Livestream commerce screenshots</w:t>
+            </w:r>
+          </w:p>
+        </w:tc>
+        <w:tc>
+          <w:tcPr>
+            <w:vAlign w:val="center"/>
+            <w:tcMar>
+              <w:top w:w="100" w:type="dxa"/>
+              <w:left w:w="100" w:type="dxa"/>
+              <w:bottom w:w="100" w:type="dxa"/>
+              <w:right w:w="100" w:type="dxa"/>
+            </w:tcMar>
+          </w:tcPr>
+          <w:p>
+            <w:pPr>
+              <w:pStyle w:val="Compact"/>
+              <w:spacing w:line="276" w:lineRule="auto" w:before="0" w:after="0"/>
+              <w:ind w:firstLine="0"/>
+              <w:jc w:val="right"/>
+            </w:pPr>
+            <w:r>
+              <w:rPr>
+                <w:rFonts w:ascii="Times New Roman" w:hAnsi="Times New Roman" w:eastAsia="Times New Roman" w:cs="Times New Roman"/>
+                <w:sz w:val="22"/>
+              </w:rPr>
+              <w:t xml:space="preserve">2.70</w:t>
+            </w:r>
+          </w:p>
+        </w:tc>
+      </w:tr>
+      <w:tr>
+        <w:tc>
+          <w:tcPr>
+            <w:vAlign w:val="center"/>
+            <w:tcMar>
+              <w:top w:w="100" w:type="dxa"/>
+              <w:left w:w="100" w:type="dxa"/>
+              <w:bottom w:w="100" w:type="dxa"/>
+              <w:right w:w="100" w:type="dxa"/>
+            </w:tcMar>
+          </w:tcPr>
+          <w:p>
+            <w:pPr>
+              <w:pStyle w:val="Compact"/>
+              <w:spacing w:line="276" w:lineRule="auto" w:before="0" w:after="0"/>
+              <w:ind w:firstLine="0"/>
+              <w:jc w:val="left"/>
+            </w:pPr>
+            <w:r>
+              <w:rPr>
+                <w:rFonts w:ascii="Times New Roman" w:hAnsi="Times New Roman" w:eastAsia="Times New Roman" w:cs="Times New Roman"/>
+                <w:sz w:val="22"/>
+              </w:rPr>
+              <w:t xml:space="preserve">Food photographs</w:t>
+            </w:r>
+          </w:p>
+        </w:tc>
+        <w:tc>
+          <w:tcPr>
+            <w:vAlign w:val="center"/>
+            <w:tcMar>
+              <w:top w:w="100" w:type="dxa"/>
+              <w:left w:w="100" w:type="dxa"/>
+              <w:bottom w:w="100" w:type="dxa"/>
+              <w:right w:w="100" w:type="dxa"/>
+            </w:tcMar>
+          </w:tcPr>
+          <w:p>
+            <w:pPr>
+              <w:pStyle w:val="Compact"/>
+              <w:spacing w:line="276" w:lineRule="auto" w:before="0" w:after="0"/>
+              <w:ind w:firstLine="0"/>
+              <w:jc w:val="right"/>
+            </w:pPr>
+            <w:r>
+              <w:rPr>
+                <w:rFonts w:ascii="Times New Roman" w:hAnsi="Times New Roman" w:eastAsia="Times New Roman" w:cs="Times New Roman"/>
+                <w:sz w:val="22"/>
+              </w:rPr>
+              <w:t xml:space="preserve">2.62</w:t>
+            </w:r>
+          </w:p>
+        </w:tc>
+      </w:tr>
+    </w:tbl>
+    <w:p>
+      <w:pPr>
+        <w:pStyle w:val="CaptionedFigure"/>
+        <w:keepNext w:val="0"/>
+        <w:keepLines w:val="0"/>
+        <w:spacing w:line="480" w:lineRule="auto" w:before="0" w:after="0"/>
+      </w:pPr>
+      <w:r>
+        <w:rPr>
+          <w:rFonts w:ascii="Times New Roman" w:hAnsi="Times New Roman" w:eastAsia="Times New Roman" w:cs="Times New Roman"/>
+          <w:sz w:val="22"/>
+        </w:rPr>
+        <w:drawing>
+          <wp:inline>
+            <wp:extent cx="5334000" cy="3360080"/>
+            <wp:effectExtent b="0" l="0" r="0" t="0"/>
+            <wp:docPr descr="Figure 3. Mean trust rating by visual category." title="" id="1" name="Picture"/>
+            <a:graphic>
+              <a:graphicData uri="http://schemas.openxmlformats.org/drawingml/2006/picture">
+                <pic:pic>
+                  <pic:nvPicPr>
+                    <pic:cNvPr descr="trust_by_category.png" id="0" name="Picture"/>
+                    <pic:cNvPicPr>
+                      <a:picLocks noChangeArrowheads="1" noChangeAspect="1"/>
+                    </pic:cNvPicPr>
+                  </pic:nvPicPr>
+                  <pic:blipFill>
+                    <a:blip r:embed="rId29"/>
+                    <a:stretch>
+                      <a:fillRect/>
+                    </a:stretch>
+                  </pic:blipFill>
+                  <pic:spPr bwMode="auto">
+                    <a:xfrm>
+                      <a:off x="0" y="0"/>
+                      <a:ext cx="5334000" cy="3360080"/>
+                    </a:xfrm>
+                    <a:prstGeom prst="rect">
+                      <a:avLst/>
+                    </a:prstGeom>
+                    <a:noFill/>
+                    <a:ln w="9525">
+                      <a:noFill/>
+                      <a:headEnd/>
+                      <a:tailEnd/>
+                    </a:ln>
+                  </pic:spPr>
+                </pic:pic>
+              </a:graphicData>
+            </a:graphic>
+          </wp:inline>
+        </w:drawing>
+      </w:r>
+    </w:p>
+    <w:p>
+      <w:pPr>
+        <w:pStyle w:val="Caption"/>
+        <w:keepNext w:val="0"/>
+        <w:keepLines w:val="0"/>
+        <w:spacing w:line="480" w:lineRule="auto" w:before="120" w:after="120"/>
+        <w:ind w:firstLine="0" w:left="0"/>
+        <w:jc w:val="center"/>
+      </w:pPr>
+      <w:r>
+        <w:rPr>
+          <w:rFonts w:ascii="Times New Roman" w:hAnsi="Times New Roman" w:eastAsia="Times New Roman" w:cs="Times New Roman"/>
+          <w:b/>
+          <w:sz w:val="22"/>
+        </w:rPr>
+        <w:t>Figure 3.</w:t>
+      </w:r>
+      <w:r>
+        <w:rPr>
+          <w:rFonts w:ascii="Times New Roman" w:hAnsi="Times New Roman" w:eastAsia="Times New Roman" w:cs="Times New Roman"/>
+          <w:b w:val="0"/>
+          <w:sz w:val="22"/>
+        </w:rPr>
+        <w:t xml:space="preserve"> Mean trust rating by visual category.</w:t>
+      </w:r>
+    </w:p>
+    <w:p>
+      <w:pPr>
         <w:pStyle w:val="BodyText"/>
         <w:keepNext w:val="0"/>
         <w:keepLines w:val="0"/>
@@ -2753,8 +3302,8 @@
         <w:t xml:space="preserve">or context when seeing realistic online images or screenshots.</w:t>
       </w:r>
     </w:p>
-    <w:bookmarkEnd w:id="29"/>
-    <w:bookmarkStart w:id="34" w:name="discussion"/>
+    <w:bookmarkEnd w:id="30"/>
+    <w:bookmarkStart w:id="35" w:name="discussion"/>
     <w:p>
       <w:pPr>
         <w:pStyle w:val="Heading2"/>
@@ -2770,7 +3319,7 @@
         <w:t xml:space="preserve">Discussion</w:t>
       </w:r>
     </w:p>
-    <w:bookmarkStart w:id="30" w:name="summary-of-findings"/>
+    <w:bookmarkStart w:id="31" w:name="summary-of-findings"/>
     <w:p>
       <w:pPr>
         <w:pStyle w:val="Heading3"/>
@@ -3000,8 +3549,8 @@
         <w:t xml:space="preserve">look polished or artificial.</w:t>
       </w:r>
     </w:p>
-    <w:bookmarkEnd w:id="30"/>
-    <w:bookmarkStart w:id="31" w:name="comparison-with-previous-studies"/>
+    <w:bookmarkEnd w:id="31"/>
+    <w:bookmarkStart w:id="32" w:name="comparison-with-previous-studies"/>
     <w:p>
       <w:pPr>
         <w:pStyle w:val="Heading3"/>
@@ -3275,8 +3824,8 @@
         <w:t xml:space="preserve">details can also make them look socially and contextually credible.</w:t>
       </w:r>
     </w:p>
-    <w:bookmarkEnd w:id="31"/>
-    <w:bookmarkStart w:id="32" w:name="possible-reasons"/>
+    <w:bookmarkEnd w:id="32"/>
+    <w:bookmarkStart w:id="33" w:name="possible-reasons"/>
     <w:p>
       <w:pPr>
         <w:pStyle w:val="Heading3"/>
@@ -3550,8 +4099,8 @@
         <w:t xml:space="preserve">photographs, but also as a problem of fake visual context.</w:t>
       </w:r>
     </w:p>
-    <w:bookmarkEnd w:id="32"/>
-    <w:bookmarkStart w:id="33" w:name="limitations-and-implications"/>
+    <w:bookmarkEnd w:id="33"/>
+    <w:bookmarkStart w:id="34" w:name="limitations-and-implications"/>
     <w:p>
       <w:pPr>
         <w:pStyle w:val="Heading3"/>
@@ -3839,9 +4388,9 @@
         <w:t xml:space="preserve">training.</w:t>
       </w:r>
     </w:p>
-    <w:bookmarkEnd w:id="33"/>
     <w:bookmarkEnd w:id="34"/>
-    <w:bookmarkStart w:id="35" w:name="references"/>
+    <w:bookmarkEnd w:id="35"/>
+    <w:bookmarkStart w:id="36" w:name="references"/>
     <w:p>
       <w:pPr>
         <w:pStyle w:val="Heading2"/>
@@ -4563,8 +5112,8 @@
         <w:t xml:space="preserve">(1). https://doi.org/10.1177/2056305120903408</w:t>
       </w:r>
     </w:p>
-    <w:bookmarkEnd w:id="35"/>
     <w:bookmarkEnd w:id="36"/>
+    <w:bookmarkEnd w:id="37"/>
     <w:sectPr>
       <w:footerReference w:type="default" r:id="rId9"/>
       <w:pgMar w:top="1440" w:bottom="1440" w:left="1440" w:right="1440" w:header="720" w:footer="720"/>

</xml_diff>